<commit_message>
Updates from Week 16. Day 2
</commit_message>
<xml_diff>
--- a/data/moodwave_case_study.docx
+++ b/data/moodwave_case_study.docx
@@ -139,12 +139,6 @@
         <w:gridCol w:w="2340"/>
       </w:tblGrid>
       <w:tr>
-        <w:tblPrEx>
-          <w:tblCellMar>
-            <w:top w:w="0" w:type="dxa"/>
-            <w:bottom w:w="0" w:type="dxa"/>
-          </w:tblCellMar>
-        </w:tblPrEx>
         <w:tc>
           <w:tcPr>
             <w:tcW w:w="2340" w:type="dxa"/>
@@ -362,12 +356,6 @@
         <w:gridCol w:w="6360"/>
       </w:tblGrid>
       <w:tr>
-        <w:tblPrEx>
-          <w:tblCellMar>
-            <w:top w:w="0" w:type="dxa"/>
-            <w:bottom w:w="0" w:type="dxa"/>
-          </w:tblCellMar>
-        </w:tblPrEx>
         <w:tc>
           <w:tcPr>
             <w:tcW w:w="3000" w:type="dxa"/>
@@ -438,12 +426,6 @@
         </w:tc>
       </w:tr>
       <w:tr>
-        <w:tblPrEx>
-          <w:tblCellMar>
-            <w:top w:w="0" w:type="dxa"/>
-            <w:bottom w:w="0" w:type="dxa"/>
-          </w:tblCellMar>
-        </w:tblPrEx>
         <w:tc>
           <w:tcPr>
             <w:tcW w:w="3000" w:type="dxa"/>
@@ -504,12 +486,6 @@
         </w:tc>
       </w:tr>
       <w:tr>
-        <w:tblPrEx>
-          <w:tblCellMar>
-            <w:top w:w="0" w:type="dxa"/>
-            <w:bottom w:w="0" w:type="dxa"/>
-          </w:tblCellMar>
-        </w:tblPrEx>
         <w:tc>
           <w:tcPr>
             <w:tcW w:w="3000" w:type="dxa"/>
@@ -570,12 +546,6 @@
         </w:tc>
       </w:tr>
       <w:tr>
-        <w:tblPrEx>
-          <w:tblCellMar>
-            <w:top w:w="0" w:type="dxa"/>
-            <w:bottom w:w="0" w:type="dxa"/>
-          </w:tblCellMar>
-        </w:tblPrEx>
         <w:tc>
           <w:tcPr>
             <w:tcW w:w="3000" w:type="dxa"/>
@@ -636,12 +606,6 @@
         </w:tc>
       </w:tr>
       <w:tr>
-        <w:tblPrEx>
-          <w:tblCellMar>
-            <w:top w:w="0" w:type="dxa"/>
-            <w:bottom w:w="0" w:type="dxa"/>
-          </w:tblCellMar>
-        </w:tblPrEx>
         <w:tc>
           <w:tcPr>
             <w:tcW w:w="3000" w:type="dxa"/>
@@ -1639,12 +1603,6 @@
         <w:gridCol w:w="5160"/>
       </w:tblGrid>
       <w:tr>
-        <w:tblPrEx>
-          <w:tblCellMar>
-            <w:top w:w="0" w:type="dxa"/>
-            <w:bottom w:w="0" w:type="dxa"/>
-          </w:tblCellMar>
-        </w:tblPrEx>
         <w:tc>
           <w:tcPr>
             <w:tcW w:w="720" w:type="dxa"/>
@@ -1741,12 +1699,6 @@
         </w:tc>
       </w:tr>
       <w:tr>
-        <w:tblPrEx>
-          <w:tblCellMar>
-            <w:top w:w="0" w:type="dxa"/>
-            <w:bottom w:w="0" w:type="dxa"/>
-          </w:tblCellMar>
-        </w:tblPrEx>
         <w:tc>
           <w:tcPr>
             <w:tcW w:w="720" w:type="dxa"/>
@@ -1867,12 +1819,6 @@
         </w:tc>
       </w:tr>
       <w:tr>
-        <w:tblPrEx>
-          <w:tblCellMar>
-            <w:top w:w="0" w:type="dxa"/>
-            <w:bottom w:w="0" w:type="dxa"/>
-          </w:tblCellMar>
-        </w:tblPrEx>
         <w:tc>
           <w:tcPr>
             <w:tcW w:w="720" w:type="dxa"/>
@@ -1993,12 +1939,6 @@
         </w:tc>
       </w:tr>
       <w:tr>
-        <w:tblPrEx>
-          <w:tblCellMar>
-            <w:top w:w="0" w:type="dxa"/>
-            <w:bottom w:w="0" w:type="dxa"/>
-          </w:tblCellMar>
-        </w:tblPrEx>
         <w:tc>
           <w:tcPr>
             <w:tcW w:w="720" w:type="dxa"/>
@@ -2119,12 +2059,6 @@
         </w:tc>
       </w:tr>
       <w:tr>
-        <w:tblPrEx>
-          <w:tblCellMar>
-            <w:top w:w="0" w:type="dxa"/>
-            <w:bottom w:w="0" w:type="dxa"/>
-          </w:tblCellMar>
-        </w:tblPrEx>
         <w:tc>
           <w:tcPr>
             <w:tcW w:w="720" w:type="dxa"/>
@@ -2632,12 +2566,6 @@
         <w:gridCol w:w="5160"/>
       </w:tblGrid>
       <w:tr>
-        <w:tblPrEx>
-          <w:tblCellMar>
-            <w:top w:w="0" w:type="dxa"/>
-            <w:bottom w:w="0" w:type="dxa"/>
-          </w:tblCellMar>
-        </w:tblPrEx>
         <w:tc>
           <w:tcPr>
             <w:tcW w:w="1400" w:type="dxa"/>
@@ -2733,12 +2661,6 @@
         </w:tc>
       </w:tr>
       <w:tr>
-        <w:tblPrEx>
-          <w:tblCellMar>
-            <w:top w:w="0" w:type="dxa"/>
-            <w:bottom w:w="0" w:type="dxa"/>
-          </w:tblCellMar>
-        </w:tblPrEx>
         <w:tc>
           <w:tcPr>
             <w:tcW w:w="1400" w:type="dxa"/>
@@ -2833,12 +2755,6 @@
         </w:tc>
       </w:tr>
       <w:tr>
-        <w:tblPrEx>
-          <w:tblCellMar>
-            <w:top w:w="0" w:type="dxa"/>
-            <w:bottom w:w="0" w:type="dxa"/>
-          </w:tblCellMar>
-        </w:tblPrEx>
         <w:tc>
           <w:tcPr>
             <w:tcW w:w="1400" w:type="dxa"/>
@@ -2951,12 +2867,6 @@
         </w:tc>
       </w:tr>
       <w:tr>
-        <w:tblPrEx>
-          <w:tblCellMar>
-            <w:top w:w="0" w:type="dxa"/>
-            <w:bottom w:w="0" w:type="dxa"/>
-          </w:tblCellMar>
-        </w:tblPrEx>
         <w:tc>
           <w:tcPr>
             <w:tcW w:w="1400" w:type="dxa"/>
@@ -3099,12 +3009,6 @@
         </w:tc>
       </w:tr>
       <w:tr>
-        <w:tblPrEx>
-          <w:tblCellMar>
-            <w:top w:w="0" w:type="dxa"/>
-            <w:bottom w:w="0" w:type="dxa"/>
-          </w:tblCellMar>
-        </w:tblPrEx>
         <w:tc>
           <w:tcPr>
             <w:tcW w:w="1400" w:type="dxa"/>
@@ -3213,6 +3117,7 @@
               </w:rPr>
               <w:t xml:space="preserve"> should act </w:t>
             </w:r>
+            <w:proofErr w:type="spellStart"/>
             <w:proofErr w:type="gramStart"/>
             <w:r>
               <w:rPr>
@@ -3220,8 +3125,9 @@
                 <w:sz w:val="21"/>
                 <w:szCs w:val="21"/>
               </w:rPr>
-              <w:t>on, and</w:t>
-            </w:r>
+              <w:t>on,and</w:t>
+            </w:r>
+            <w:proofErr w:type="spellEnd"/>
             <w:proofErr w:type="gramEnd"/>
             <w:r>
               <w:rPr>
@@ -3323,12 +3229,6 @@
         <w:gridCol w:w="8460"/>
       </w:tblGrid>
       <w:tr>
-        <w:tblPrEx>
-          <w:tblCellMar>
-            <w:top w:w="0" w:type="dxa"/>
-            <w:bottom w:w="0" w:type="dxa"/>
-          </w:tblCellMar>
-        </w:tblPrEx>
         <w:tc>
           <w:tcPr>
             <w:tcW w:w="900" w:type="dxa"/>
@@ -3394,12 +3294,6 @@
         </w:tc>
       </w:tr>
       <w:tr>
-        <w:tblPrEx>
-          <w:tblCellMar>
-            <w:top w:w="0" w:type="dxa"/>
-            <w:bottom w:w="0" w:type="dxa"/>
-          </w:tblCellMar>
-        </w:tblPrEx>
         <w:tc>
           <w:tcPr>
             <w:tcW w:w="900" w:type="dxa"/>
@@ -3490,12 +3384,6 @@
         </w:tc>
       </w:tr>
       <w:tr>
-        <w:tblPrEx>
-          <w:tblCellMar>
-            <w:top w:w="0" w:type="dxa"/>
-            <w:bottom w:w="0" w:type="dxa"/>
-          </w:tblCellMar>
-        </w:tblPrEx>
         <w:tc>
           <w:tcPr>
             <w:tcW w:w="900" w:type="dxa"/>
@@ -3576,12 +3464,6 @@
         </w:tc>
       </w:tr>
       <w:tr>
-        <w:tblPrEx>
-          <w:tblCellMar>
-            <w:top w:w="0" w:type="dxa"/>
-            <w:bottom w:w="0" w:type="dxa"/>
-          </w:tblCellMar>
-        </w:tblPrEx>
         <w:tc>
           <w:tcPr>
             <w:tcW w:w="900" w:type="dxa"/>
@@ -3662,12 +3544,6 @@
         </w:tc>
       </w:tr>
       <w:tr>
-        <w:tblPrEx>
-          <w:tblCellMar>
-            <w:top w:w="0" w:type="dxa"/>
-            <w:bottom w:w="0" w:type="dxa"/>
-          </w:tblCellMar>
-        </w:tblPrEx>
         <w:tc>
           <w:tcPr>
             <w:tcW w:w="900" w:type="dxa"/>
@@ -3748,12 +3624,6 @@
         </w:tc>
       </w:tr>
       <w:tr>
-        <w:tblPrEx>
-          <w:tblCellMar>
-            <w:top w:w="0" w:type="dxa"/>
-            <w:bottom w:w="0" w:type="dxa"/>
-          </w:tblCellMar>
-        </w:tblPrEx>
         <w:tc>
           <w:tcPr>
             <w:tcW w:w="900" w:type="dxa"/>
@@ -3834,12 +3704,9 @@
         </w:tc>
       </w:tr>
       <w:tr>
-        <w:tblPrEx>
-          <w:tblCellMar>
-            <w:top w:w="0" w:type="dxa"/>
-            <w:bottom w:w="0" w:type="dxa"/>
-          </w:tblCellMar>
-        </w:tblPrEx>
+        <w:trPr>
+          <w:trHeight w:val="18"/>
+        </w:trPr>
         <w:tc>
           <w:tcPr>
             <w:tcW w:w="900" w:type="dxa"/>

</xml_diff>